<commit_message>
added files in input/output folder to prevent them from getting deleted
</commit_message>
<xml_diff>
--- a/Guide.docx
+++ b/Guide.docx
@@ -313,8 +313,16 @@
       <w:r>
         <w:t xml:space="preserve"> </w:t>
       </w:r>
-      <w:r>
-        <w:t>https://github.com/SanderSMFISH/flofish.git</w:t>
+      <w:hyperlink r:id="rId6" w:history="1">
+        <w:r>
+          <w:rPr>
+            <w:rStyle w:val="Hyperlink"/>
+          </w:rPr>
+          <w:t>https://github.com/SanderSMFISH/flofish.git</w:t>
+        </w:r>
+      </w:hyperlink>
+      <w:r>
+        <w:t xml:space="preserve"> (is not working)</w:t>
       </w:r>
       <w:r>
         <w:br/>
@@ -465,6 +473,9 @@
       </w:r>
       <w:r>
         <w:br/>
+      </w:r>
+      <w:r>
+        <w:lastRenderedPageBreak/>
         <w:t xml:space="preserve">    git push origin </w:t>
       </w:r>
       <w:r>
@@ -485,7 +496,6 @@
         <w:pStyle w:val="Heading1"/>
       </w:pPr>
       <w:r>
-        <w:lastRenderedPageBreak/>
         <w:t xml:space="preserve">Creating an anaconda environment and installing </w:t>
       </w:r>
       <w:proofErr w:type="spellStart"/>
@@ -591,7 +601,10 @@
       </w:r>
       <w:proofErr w:type="spellStart"/>
       <w:r>
-        <w:t>flofish</w:t>
+        <w:t>flofis</w:t>
+      </w:r>
+      <w:r>
+        <w:t>h</w:t>
       </w:r>
       <w:proofErr w:type="spellEnd"/>
     </w:p>
@@ -748,9 +761,6 @@
         <w:tab/>
         <w:t>“pip install -e .”</w:t>
       </w:r>
-      <w:r>
-        <w:t xml:space="preserve">cd </w:t>
-      </w:r>
     </w:p>
     <w:p>
       <w:pPr>
@@ -854,6 +864,7 @@
     </w:p>
     <w:p>
       <w:r>
+        <w:lastRenderedPageBreak/>
         <w:t xml:space="preserve">This script will execute all the code contained in the </w:t>
       </w:r>
       <w:proofErr w:type="spellStart"/>
@@ -870,7 +881,6 @@
         <w:pStyle w:val="Heading1"/>
       </w:pPr>
       <w:r>
-        <w:lastRenderedPageBreak/>
         <w:t xml:space="preserve">Some background on the </w:t>
       </w:r>
       <w:proofErr w:type="spellStart"/>
@@ -939,6 +949,9 @@
     </w:p>
     <w:p>
       <w:r>
+        <w:rPr>
+          <w:noProof/>
+        </w:rPr>
         <w:drawing>
           <wp:inline distT="0" distB="0" distL="0" distR="0" wp14:anchorId="355DC168" wp14:editId="30A979B7">
             <wp:extent cx="2779550" cy="6339840"/>
@@ -955,7 +968,7 @@
                     <pic:cNvPicPr/>
                   </pic:nvPicPr>
                   <pic:blipFill>
-                    <a:blip r:embed="rId6"/>
+                    <a:blip r:embed="rId7"/>
                     <a:stretch>
                       <a:fillRect/>
                     </a:stretch>
@@ -988,6 +1001,7 @@
           <w:b/>
           <w:bCs/>
         </w:rPr>
+        <w:lastRenderedPageBreak/>
         <w:t xml:space="preserve">Figure 1. </w:t>
       </w:r>
       <w:r>
@@ -1084,7 +1098,7 @@
                     </pic:cNvPicPr>
                   </pic:nvPicPr>
                   <pic:blipFill rotWithShape="1">
-                    <a:blip r:embed="rId7">
+                    <a:blip r:embed="rId8">
                       <a:extLst>
                         <a:ext uri="{28A0092B-C50C-407E-A947-70E740481C1C}">
                           <a14:useLocalDpi xmlns:a14="http://schemas.microsoft.com/office/drawing/2010/main" val="0"/>
@@ -1135,155 +1149,144 @@
           <w:b/>
           <w:bCs/>
         </w:rPr>
-        <w:t xml:space="preserve">Figure </w:t>
+        <w:t xml:space="preserve">Figure 2. </w:t>
+      </w:r>
+      <w:r>
+        <w:t xml:space="preserve">Example of </w:t>
+      </w:r>
+      <w:proofErr w:type="spellStart"/>
+      <w:r>
+        <w:t>img</w:t>
+      </w:r>
+      <w:r>
+        <w:t>.json</w:t>
+      </w:r>
+      <w:proofErr w:type="spellEnd"/>
+      <w:r>
+        <w:t xml:space="preserve"> file</w:t>
+      </w:r>
+      <w:r>
+        <w:t xml:space="preserve">. </w:t>
       </w:r>
       <w:r>
         <w:rPr>
           <w:b/>
           <w:bCs/>
         </w:rPr>
-        <w:t>2</w:t>
+        <w:t>This file is produced during the analysis.</w:t>
+      </w:r>
+    </w:p>
+    <w:p>
+      <w:pPr>
+        <w:pStyle w:val="Heading1"/>
+      </w:pPr>
+      <w:r>
+        <w:t>Exploring</w:t>
+      </w:r>
+      <w:r>
+        <w:t xml:space="preserve"> </w:t>
+      </w:r>
+      <w:r>
+        <w:t xml:space="preserve">the </w:t>
+      </w:r>
+      <w:proofErr w:type="spellStart"/>
+      <w:r>
+        <w:t>napari-flofish</w:t>
+      </w:r>
+      <w:proofErr w:type="spellEnd"/>
+      <w:r>
+        <w:t xml:space="preserve"> plugin</w:t>
+      </w:r>
+    </w:p>
+    <w:p>
+      <w:r>
+        <w:t xml:space="preserve">The parameters necessary in bulk processing can be explored using the </w:t>
+      </w:r>
+      <w:proofErr w:type="spellStart"/>
+      <w:r>
+        <w:t>napari-floFISH</w:t>
+      </w:r>
+      <w:proofErr w:type="spellEnd"/>
+      <w:r>
+        <w:t xml:space="preserve"> plugin.   </w:t>
+      </w:r>
+    </w:p>
+    <w:p>
+      <w:r>
+        <w:lastRenderedPageBreak/>
+        <w:t>To open the plugin, i</w:t>
+      </w:r>
+      <w:r>
+        <w:t xml:space="preserve">n your command prompt/shell type: </w:t>
+      </w:r>
+    </w:p>
+    <w:p>
+      <w:r>
+        <w:tab/>
+        <w:t>“</w:t>
+      </w:r>
+      <w:proofErr w:type="spellStart"/>
+      <w:r>
+        <w:t>napari</w:t>
+      </w:r>
+      <w:proofErr w:type="spellEnd"/>
+      <w:r>
+        <w:t>”</w:t>
+      </w:r>
+    </w:p>
+    <w:p>
+      <w:r>
+        <w:t xml:space="preserve">In the toolbar, click “Plugins” and hover the mouse over the </w:t>
+      </w:r>
+      <w:proofErr w:type="spellStart"/>
+      <w:r>
+        <w:t>Napari</w:t>
+      </w:r>
+      <w:proofErr w:type="spellEnd"/>
+      <w:r>
+        <w:t xml:space="preserve"> </w:t>
+      </w:r>
+      <w:proofErr w:type="spellStart"/>
+      <w:r>
+        <w:t>Flofish</w:t>
+      </w:r>
+      <w:proofErr w:type="spellEnd"/>
+      <w:r>
+        <w:t xml:space="preserve"> menu. A drop-down menu will appear with different options. Click the first option named “Read in VSI file”.  </w:t>
+      </w:r>
+      <w:r>
+        <w:t xml:space="preserve">A graphical user element will appear on the right hand of the screen (see </w:t>
       </w:r>
       <w:r>
         <w:rPr>
           <w:b/>
           <w:bCs/>
         </w:rPr>
-        <w:t xml:space="preserve">. </w:t>
-      </w:r>
-      <w:r>
-        <w:t xml:space="preserve">Example of </w:t>
+        <w:t>Figure 3</w:t>
+      </w:r>
+      <w:r>
+        <w:t xml:space="preserve">). This element can be used to load a single VSI image into your viewer. First, select the files in the </w:t>
       </w:r>
       <w:proofErr w:type="spellStart"/>
       <w:r>
-        <w:t>img</w:t>
-      </w:r>
-      <w:r>
-        <w:t>.json</w:t>
+        <w:t>config.json</w:t>
       </w:r>
       <w:proofErr w:type="spellEnd"/>
       <w:r>
-        <w:t xml:space="preserve"> file</w:t>
-      </w:r>
-      <w:r>
-        <w:t xml:space="preserve">. </w:t>
-      </w:r>
-      <w:r>
-        <w:rPr>
-          <w:b/>
-          <w:bCs/>
-        </w:rPr>
-        <w:t>This file is produced during the analysis.</w:t>
+        <w:t>, VSI and DIC image you want to open.</w:t>
+      </w:r>
+      <w:r>
+        <w:t xml:space="preserve"> Next, press run to load the image into the viewer.</w:t>
+      </w:r>
+      <w:r>
+        <w:t xml:space="preserve"> </w:t>
       </w:r>
     </w:p>
     <w:p>
-      <w:pPr>
-        <w:pStyle w:val="Heading1"/>
-      </w:pPr>
-      <w:r>
-        <w:t>Exploring</w:t>
-      </w:r>
-      <w:r>
-        <w:t xml:space="preserve"> </w:t>
-      </w:r>
-      <w:r>
-        <w:t xml:space="preserve">the </w:t>
-      </w:r>
-      <w:proofErr w:type="spellStart"/>
-      <w:r>
-        <w:t>napari-flofish</w:t>
-      </w:r>
-      <w:proofErr w:type="spellEnd"/>
-      <w:r>
-        <w:t xml:space="preserve"> plugin</w:t>
-      </w:r>
-    </w:p>
-    <w:p>
-      <w:r>
-        <w:t xml:space="preserve">The parameters necessary in bulk processing can be explored using the </w:t>
-      </w:r>
-      <w:proofErr w:type="spellStart"/>
-      <w:r>
-        <w:t>napari-floFISH</w:t>
-      </w:r>
-      <w:proofErr w:type="spellEnd"/>
-      <w:r>
-        <w:t xml:space="preserve"> plugin.   </w:t>
-      </w:r>
-    </w:p>
-    <w:p>
-      <w:r>
-        <w:t>To open the plugin, i</w:t>
-      </w:r>
-      <w:r>
-        <w:t xml:space="preserve">n your command prompt/shell type: </w:t>
-      </w:r>
-    </w:p>
-    <w:p>
-      <w:r>
-        <w:tab/>
-        <w:t>“</w:t>
-      </w:r>
-      <w:proofErr w:type="spellStart"/>
-      <w:r>
-        <w:t>napari</w:t>
-      </w:r>
-      <w:proofErr w:type="spellEnd"/>
-      <w:r>
-        <w:t>”</w:t>
-      </w:r>
-    </w:p>
-    <w:p>
-      <w:r>
-        <w:lastRenderedPageBreak/>
-        <w:t xml:space="preserve">In the toolbar, click “Plugins” and hover the mouse over the </w:t>
-      </w:r>
-      <w:proofErr w:type="spellStart"/>
-      <w:r>
-        <w:t>Napari</w:t>
-      </w:r>
-      <w:proofErr w:type="spellEnd"/>
-      <w:r>
-        <w:t xml:space="preserve"> </w:t>
-      </w:r>
-      <w:proofErr w:type="spellStart"/>
-      <w:r>
-        <w:t>Flofish</w:t>
-      </w:r>
-      <w:proofErr w:type="spellEnd"/>
-      <w:r>
-        <w:t xml:space="preserve"> menu. A drop-down menu will appear with different options. Click the first option named “Read in VSI file”.  </w:t>
-      </w:r>
-      <w:r>
-        <w:t xml:space="preserve">A graphical user element will appear on the right hand of the screen (see </w:t>
-      </w:r>
-      <w:r>
-        <w:rPr>
-          <w:b/>
-          <w:bCs/>
-        </w:rPr>
-        <w:t>Figure 3</w:t>
-      </w:r>
-      <w:r>
-        <w:t xml:space="preserve">). This element can be used to load a single VSI image into your viewer. First, select the files in the </w:t>
-      </w:r>
-      <w:proofErr w:type="spellStart"/>
-      <w:r>
-        <w:t>config.json</w:t>
-      </w:r>
-      <w:proofErr w:type="spellEnd"/>
-      <w:r>
-        <w:t>, VSI and DIC image you want to open.</w:t>
-      </w:r>
-      <w:r>
-        <w:t xml:space="preserve"> Next, press run to load the image into the viewer.</w:t>
-      </w:r>
-      <w:r>
-        <w:t xml:space="preserve"> </w:t>
-      </w:r>
-    </w:p>
-    <w:p>
-      <w:r>
+      <w:r>
+        <w:rPr>
+          <w:noProof/>
+        </w:rPr>
         <w:drawing>
           <wp:inline distT="0" distB="0" distL="0" distR="0" wp14:anchorId="44AE19E2" wp14:editId="3B586885">
             <wp:extent cx="3171824" cy="2105025"/>
@@ -1300,7 +1303,7 @@
                     <pic:cNvPicPr/>
                   </pic:nvPicPr>
                   <pic:blipFill rotWithShape="1">
-                    <a:blip r:embed="rId8"/>
+                    <a:blip r:embed="rId9"/>
                     <a:srcRect l="3198" t="6780" b="18305"/>
                     <a:stretch/>
                   </pic:blipFill>
@@ -1333,7 +1336,7 @@
         <w:rPr>
           <w:b/>
           <w:bCs/>
-          <w:lang w:val="it-IT"/>
+          <w:lang w:val="en-GB"/>
         </w:rPr>
       </w:pPr>
       <w:r>
@@ -1344,147 +1347,122 @@
         <w:t xml:space="preserve">Figure 3. </w:t>
       </w:r>
       <w:r>
+        <w:rPr>
+          <w:b/>
+          <w:bCs/>
+          <w:lang w:val="en-GB"/>
+        </w:rPr>
+        <w:t>Read in VSI file GUI element.</w:t>
+      </w:r>
+    </w:p>
+    <w:p>
+      <w:pPr>
+        <w:rPr>
+          <w:lang w:val="en-GB"/>
+        </w:rPr>
+      </w:pPr>
+      <w:r>
+        <w:rPr>
+          <w:lang w:val="en-GB"/>
+        </w:rPr>
+        <w:t>Now open the new</w:t>
+      </w:r>
+      <w:r>
+        <w:rPr>
+          <w:lang w:val="en-GB"/>
+        </w:rPr>
+        <w:t xml:space="preserve"> plugin in the dropdown menu named </w:t>
+      </w:r>
+      <w:r>
+        <w:rPr>
+          <w:lang w:val="en-GB"/>
+        </w:rPr>
+        <w:t>“</w:t>
+      </w:r>
+      <w:r>
+        <w:rPr>
+          <w:lang w:val="en-GB"/>
+        </w:rPr>
+        <w:t>Filter out background”.</w:t>
+      </w:r>
+      <w:r>
+        <w:rPr>
+          <w:b/>
+          <w:bCs/>
+          <w:lang w:val="en-GB"/>
+        </w:rPr>
+        <w:br/>
+      </w:r>
+      <w:r>
+        <w:rPr>
+          <w:lang w:val="en-GB"/>
+        </w:rPr>
+        <w:t xml:space="preserve">Next, perform background filtering of </w:t>
+      </w:r>
+      <w:r>
+        <w:rPr>
+          <w:lang w:val="en-GB"/>
+        </w:rPr>
+        <w:t>one of</w:t>
+      </w:r>
+      <w:r>
+        <w:rPr>
+          <w:lang w:val="en-GB"/>
+        </w:rPr>
+        <w:t xml:space="preserve"> the FISH channels</w:t>
+      </w:r>
+      <w:r>
+        <w:rPr>
+          <w:lang w:val="en-GB"/>
+        </w:rPr>
+        <w:t xml:space="preserve"> by selecting </w:t>
+      </w:r>
+      <w:r>
+        <w:rPr>
+          <w:lang w:val="en-GB"/>
+        </w:rPr>
+        <w:t>the right image layer</w:t>
+      </w:r>
+      <w:r>
+        <w:rPr>
+          <w:lang w:val="en-GB"/>
+        </w:rPr>
+        <w:t xml:space="preserve"> and pressing run (</w:t>
+      </w:r>
+      <w:r>
+        <w:rPr>
+          <w:b/>
+          <w:bCs/>
+          <w:lang w:val="en-GB"/>
+        </w:rPr>
+        <w:t>Figure 4</w:t>
+      </w:r>
+      <w:r>
+        <w:rPr>
+          <w:lang w:val="en-GB"/>
+        </w:rPr>
+        <w:t xml:space="preserve">, </w:t>
+      </w:r>
+      <w:r>
+        <w:rPr>
+          <w:lang w:val="en-GB"/>
+        </w:rPr>
+        <w:t xml:space="preserve">default parameters will probably work with most parameters). </w:t>
+      </w:r>
+    </w:p>
+    <w:p>
+      <w:pPr>
         <w:rPr>
           <w:b/>
           <w:bCs/>
           <w:lang w:val="it-IT"/>
         </w:rPr>
-        <w:t xml:space="preserve">Read in VSI file GUI </w:t>
-      </w:r>
-      <w:proofErr w:type="spellStart"/>
+      </w:pPr>
       <w:r>
         <w:rPr>
           <w:b/>
           <w:bCs/>
-          <w:lang w:val="it-IT"/>
-        </w:rPr>
-        <w:t>elem</w:t>
-      </w:r>
-      <w:r>
-        <w:rPr>
-          <w:b/>
-          <w:bCs/>
-          <w:lang w:val="it-IT"/>
-        </w:rPr>
-        <w:t>ent</w:t>
-      </w:r>
-      <w:proofErr w:type="spellEnd"/>
-      <w:r>
-        <w:rPr>
-          <w:b/>
-          <w:bCs/>
-          <w:lang w:val="it-IT"/>
-        </w:rPr>
-        <w:t>.</w:t>
-      </w:r>
-    </w:p>
-    <w:p>
-      <w:pPr>
-        <w:rPr>
-          <w:lang w:val="en-GB"/>
-        </w:rPr>
-      </w:pPr>
-      <w:r>
-        <w:rPr>
-          <w:lang w:val="en-GB"/>
-        </w:rPr>
-        <w:t>Now open the new</w:t>
-      </w:r>
-      <w:r>
-        <w:rPr>
-          <w:lang w:val="en-GB"/>
-        </w:rPr>
-        <w:t xml:space="preserve"> plugin in the dropdown menu named </w:t>
-      </w:r>
-      <w:r>
-        <w:rPr>
-          <w:lang w:val="en-GB"/>
-        </w:rPr>
-        <w:t>“</w:t>
-      </w:r>
-      <w:r>
-        <w:rPr>
-          <w:lang w:val="en-GB"/>
-        </w:rPr>
-        <w:t>Filter out background”.</w:t>
-      </w:r>
-      <w:r>
-        <w:rPr>
-          <w:b/>
-          <w:bCs/>
-          <w:lang w:val="en-GB"/>
-        </w:rPr>
-        <w:br/>
-      </w:r>
-      <w:r>
-        <w:rPr>
-          <w:lang w:val="en-GB"/>
-        </w:rPr>
-        <w:t xml:space="preserve">Next, perform background filtering of </w:t>
-      </w:r>
-      <w:r>
-        <w:rPr>
-          <w:lang w:val="en-GB"/>
-        </w:rPr>
-        <w:t>one of</w:t>
-      </w:r>
-      <w:r>
-        <w:rPr>
-          <w:lang w:val="en-GB"/>
-        </w:rPr>
-        <w:t xml:space="preserve"> the FISH channels</w:t>
-      </w:r>
-      <w:r>
-        <w:rPr>
-          <w:lang w:val="en-GB"/>
-        </w:rPr>
-        <w:t xml:space="preserve"> by selecting </w:t>
-      </w:r>
-      <w:r>
-        <w:rPr>
-          <w:lang w:val="en-GB"/>
-        </w:rPr>
-        <w:t>the right image layer</w:t>
-      </w:r>
-      <w:r>
-        <w:rPr>
-          <w:lang w:val="en-GB"/>
-        </w:rPr>
-        <w:t xml:space="preserve"> and pressing run (</w:t>
-      </w:r>
-      <w:r>
-        <w:rPr>
-          <w:b/>
-          <w:bCs/>
-          <w:lang w:val="en-GB"/>
-        </w:rPr>
-        <w:t>Figure 4</w:t>
-      </w:r>
-      <w:r>
-        <w:rPr>
-          <w:lang w:val="en-GB"/>
-        </w:rPr>
-        <w:t xml:space="preserve">, </w:t>
-      </w:r>
-      <w:r>
-        <w:rPr>
-          <w:lang w:val="en-GB"/>
-        </w:rPr>
-        <w:t xml:space="preserve">default parameters will probably work with most parameters). </w:t>
-      </w:r>
-    </w:p>
-    <w:p>
-      <w:pPr>
-        <w:rPr>
-          <w:b/>
-          <w:bCs/>
-          <w:lang w:val="it-IT"/>
-        </w:rPr>
-      </w:pPr>
-      <w:r>
-        <w:rPr>
-          <w:b/>
-          <w:bCs/>
+          <w:noProof/>
           <w:lang w:val="it-IT"/>
         </w:rPr>
         <w:drawing>
@@ -1503,7 +1481,7 @@
                     <pic:cNvPicPr/>
                   </pic:nvPicPr>
                   <pic:blipFill>
-                    <a:blip r:embed="rId9"/>
+                    <a:blip r:embed="rId10"/>
                     <a:stretch>
                       <a:fillRect/>
                     </a:stretch>
@@ -1572,6 +1550,7 @@
         <w:rPr>
           <w:lang w:val="en-GB"/>
         </w:rPr>
+        <w:lastRenderedPageBreak/>
         <w:t xml:space="preserve">Next, </w:t>
       </w:r>
       <w:r>
@@ -1590,13 +1569,7 @@
         <w:rPr>
           <w:lang w:val="en-GB"/>
         </w:rPr>
-        <w:t xml:space="preserve"> </w:t>
-      </w:r>
-      <w:r>
-        <w:rPr>
-          <w:lang w:val="en-GB"/>
-        </w:rPr>
-        <w:t xml:space="preserve">on the produced background filtered image </w:t>
+        <w:t xml:space="preserve"> on the produced background filtered image </w:t>
       </w:r>
       <w:r>
         <w:rPr>
@@ -1608,19 +1581,7 @@
         <w:rPr>
           <w:lang w:val="en-GB"/>
         </w:rPr>
-        <w:t xml:space="preserve"> a Laplacian of Gaussian operation </w:t>
-      </w:r>
-      <w:r>
-        <w:rPr>
-          <w:lang w:val="en-GB"/>
-        </w:rPr>
-        <w:t>(Log)</w:t>
-      </w:r>
-      <w:r>
-        <w:rPr>
-          <w:lang w:val="en-GB"/>
-        </w:rPr>
-        <w:t>, followed by local maxima detection</w:t>
+        <w:t xml:space="preserve"> a Laplacian of Gaussian operation (Log), followed by local maxima detection</w:t>
       </w:r>
       <w:r>
         <w:rPr>
@@ -1671,7 +1632,6 @@
         <w:rPr>
           <w:lang w:val="en-GB"/>
         </w:rPr>
-        <w:lastRenderedPageBreak/>
         <w:t xml:space="preserve">This will produce three new layers: </w:t>
       </w:r>
     </w:p>
@@ -1943,6 +1903,7 @@
       </w:pPr>
       <w:r>
         <w:rPr>
+          <w:noProof/>
           <w:lang w:val="en-GB"/>
         </w:rPr>
         <w:drawing>
@@ -1961,7 +1922,7 @@
                     <pic:cNvPicPr/>
                   </pic:nvPicPr>
                   <pic:blipFill>
-                    <a:blip r:embed="rId10"/>
+                    <a:blip r:embed="rId11"/>
                     <a:stretch>
                       <a:fillRect/>
                     </a:stretch>
@@ -2067,7 +2028,14 @@
         <w:rPr>
           <w:lang w:val="en-GB"/>
         </w:rPr>
-        <w:t>update the threshold. Compare the newly produced spot point layer to the previous layer, how does changing the threshold affect the spot count?</w:t>
+        <w:t xml:space="preserve">update the threshold. </w:t>
+      </w:r>
+      <w:r>
+        <w:rPr>
+          <w:lang w:val="en-GB"/>
+        </w:rPr>
+        <w:lastRenderedPageBreak/>
+        <w:t>Compare the newly produced spot point layer to the previous layer, how does changing the threshold affect the spot count?</w:t>
       </w:r>
     </w:p>
     <w:p>
@@ -2082,9 +2050,9 @@
         <w:rPr>
           <w:b/>
           <w:bCs/>
-          <w:lang w:val="en-GB"/>
-        </w:rPr>
-        <w:lastRenderedPageBreak/>
+          <w:noProof/>
+          <w:lang w:val="en-GB"/>
+        </w:rPr>
         <w:drawing>
           <wp:inline distT="0" distB="0" distL="0" distR="0" wp14:anchorId="176D3614" wp14:editId="53C049D9">
             <wp:extent cx="3705742" cy="1667108"/>
@@ -2101,7 +2069,7 @@
                     <pic:cNvPicPr/>
                   </pic:nvPicPr>
                   <pic:blipFill>
-                    <a:blip r:embed="rId11"/>
+                    <a:blip r:embed="rId12"/>
                     <a:stretch>
                       <a:fillRect/>
                     </a:stretch>
@@ -2189,19 +2157,7 @@
         <w:rPr>
           <w:lang w:val="en-GB"/>
         </w:rPr>
-        <w:t xml:space="preserve">). This GUI element contains the code to identify spots with abnormal </w:t>
-      </w:r>
-      <w:r>
-        <w:rPr>
-          <w:lang w:val="en-GB"/>
-        </w:rPr>
-        <w:t xml:space="preserve">spot </w:t>
-      </w:r>
-      <w:r>
-        <w:rPr>
-          <w:lang w:val="en-GB"/>
-        </w:rPr>
-        <w:t xml:space="preserve">brightness and/ or shape, indicating that multiple RNAS are localised there (including </w:t>
+        <w:t xml:space="preserve">). This GUI element contains the code to identify spots with abnormal spot brightness and/ or shape, indicating that multiple RNAS are localised there (including </w:t>
       </w:r>
       <w:proofErr w:type="spellStart"/>
       <w:r>
@@ -2221,6 +2177,7 @@
         <w:rPr>
           <w:b/>
           <w:bCs/>
+          <w:noProof/>
           <w:lang w:val="en-GB"/>
         </w:rPr>
         <w:drawing>
@@ -2239,7 +2196,7 @@
                     <pic:cNvPicPr/>
                   </pic:nvPicPr>
                   <pic:blipFill rotWithShape="1">
-                    <a:blip r:embed="rId12"/>
+                    <a:blip r:embed="rId13"/>
                     <a:srcRect t="13333" b="17083"/>
                     <a:stretch/>
                   </pic:blipFill>
@@ -2367,6 +2324,7 @@
         <w:rPr>
           <w:b/>
           <w:bCs/>
+          <w:noProof/>
           <w:lang w:val="en-GB"/>
         </w:rPr>
         <w:drawing>
@@ -2385,7 +2343,7 @@
                     <pic:cNvPicPr/>
                   </pic:nvPicPr>
                   <pic:blipFill>
-                    <a:blip r:embed="rId13"/>
+                    <a:blip r:embed="rId14"/>
                     <a:stretch>
                       <a:fillRect/>
                     </a:stretch>
@@ -2499,9 +2457,9 @@
       </w:pPr>
       <w:r>
         <w:rPr>
-          <w:lang w:val="en-GB"/>
-        </w:rPr>
-        <w:lastRenderedPageBreak/>
+          <w:noProof/>
+          <w:lang w:val="en-GB"/>
+        </w:rPr>
         <w:drawing>
           <wp:inline distT="0" distB="0" distL="0" distR="0" wp14:anchorId="33720AC4" wp14:editId="77E74B54">
             <wp:extent cx="5486400" cy="4166870"/>
@@ -2518,7 +2476,7 @@
                     <pic:cNvPicPr/>
                   </pic:nvPicPr>
                   <pic:blipFill>
-                    <a:blip r:embed="rId14"/>
+                    <a:blip r:embed="rId15"/>
                     <a:stretch>
                       <a:fillRect/>
                     </a:stretch>
@@ -2620,10 +2578,7 @@
         <w:pStyle w:val="Heading1"/>
       </w:pPr>
       <w:r>
-        <w:t xml:space="preserve">Exploring </w:t>
-      </w:r>
-      <w:r>
-        <w:t xml:space="preserve">bulk processing with </w:t>
+        <w:t xml:space="preserve">Exploring bulk processing with </w:t>
       </w:r>
       <w:proofErr w:type="spellStart"/>
       <w:r>
@@ -2776,6 +2731,9 @@
     </w:p>
     <w:p>
       <w:r>
+        <w:rPr>
+          <w:noProof/>
+        </w:rPr>
         <w:drawing>
           <wp:inline distT="0" distB="0" distL="0" distR="0" wp14:anchorId="6FF579B6" wp14:editId="6FA3BF4E">
             <wp:extent cx="5486400" cy="3662680"/>
@@ -2792,7 +2750,7 @@
                     <pic:cNvPicPr/>
                   </pic:nvPicPr>
                   <pic:blipFill>
-                    <a:blip r:embed="rId15"/>
+                    <a:blip r:embed="rId16"/>
                     <a:stretch>
                       <a:fillRect/>
                     </a:stretch>
@@ -3042,6 +3000,39 @@
         </w:rPr>
         <w:t>=False</w:t>
       </w:r>
+    </w:p>
+    <w:p>
+      <w:pPr>
+        <w:pStyle w:val="ListParagraph"/>
+        <w:numPr>
+          <w:ilvl w:val="0"/>
+          <w:numId w:val="14"/>
+        </w:numPr>
+        <w:rPr>
+          <w:b/>
+          <w:bCs/>
+        </w:rPr>
+      </w:pPr>
+      <w:r>
+        <w:rPr>
+          <w:b/>
+          <w:bCs/>
+        </w:rPr>
+        <w:t>The folder to move the test data is not there.</w:t>
+      </w:r>
+    </w:p>
+    <w:p>
+      <w:pPr>
+        <w:pStyle w:val="ListParagraph"/>
+        <w:numPr>
+          <w:ilvl w:val="0"/>
+          <w:numId w:val="14"/>
+        </w:numPr>
+        <w:rPr>
+          <w:b/>
+          <w:bCs/>
+        </w:rPr>
+      </w:pPr>
     </w:p>
     <w:p>
       <w:r>

</xml_diff>